<commit_message>
Fixed some documents and uploaded sprint documents for this week.
</commit_message>
<xml_diff>
--- a/Sprints/Sprint Review/Sprint Review Uke 7.docx
+++ b/Sprints/Sprint Review/Sprint Review Uke 7.docx
@@ -151,7 +151,7 @@
         <w:t xml:space="preserve">Iterasjon </w:t>
       </w:r>
       <w:r>
-        <w:t>6</w:t>
+        <w:t>5</w:t>
       </w:r>
       <w:r>
         <w:t>)</w:t>
@@ -179,73 +179,7 @@
           <w:sz w:val="24"/>
           <w:szCs w:val="24"/>
         </w:rPr>
-        <w:t xml:space="preserve">Etablere </w:t>
-      </w:r>
-      <w:proofErr w:type="spellStart"/>
-      <w:r>
-        <w:rPr>
-          <w:rFonts w:asciiTheme="minorHAnsi" w:eastAsiaTheme="minorHAnsi" w:hAnsiTheme="minorHAnsi" w:cstheme="minorBidi"/>
-          <w:iCs/>
-          <w:color w:val="000000" w:themeColor="text1"/>
-          <w:sz w:val="24"/>
-          <w:szCs w:val="24"/>
-        </w:rPr>
-        <w:t>backend</w:t>
-      </w:r>
-      <w:proofErr w:type="spellEnd"/>
-      <w:r>
-        <w:rPr>
-          <w:rFonts w:asciiTheme="minorHAnsi" w:eastAsiaTheme="minorHAnsi" w:hAnsiTheme="minorHAnsi" w:cstheme="minorBidi"/>
-          <w:iCs/>
-          <w:color w:val="000000" w:themeColor="text1"/>
-          <w:sz w:val="24"/>
-          <w:szCs w:val="24"/>
-        </w:rPr>
-        <w:t>-infrastruktur (</w:t>
-      </w:r>
-      <w:proofErr w:type="spellStart"/>
-      <w:r>
-        <w:rPr>
-          <w:rFonts w:asciiTheme="minorHAnsi" w:eastAsiaTheme="minorHAnsi" w:hAnsiTheme="minorHAnsi" w:cstheme="minorBidi"/>
-          <w:iCs/>
-          <w:color w:val="000000" w:themeColor="text1"/>
-          <w:sz w:val="24"/>
-          <w:szCs w:val="24"/>
-        </w:rPr>
-        <w:t>Docker</w:t>
-      </w:r>
-      <w:proofErr w:type="spellEnd"/>
-      <w:r>
-        <w:rPr>
-          <w:rFonts w:asciiTheme="minorHAnsi" w:eastAsiaTheme="minorHAnsi" w:hAnsiTheme="minorHAnsi" w:cstheme="minorBidi"/>
-          <w:iCs/>
-          <w:color w:val="000000" w:themeColor="text1"/>
-          <w:sz w:val="24"/>
-          <w:szCs w:val="24"/>
-        </w:rPr>
-        <w:t xml:space="preserve">), starte utvikling av </w:t>
-      </w:r>
-      <w:proofErr w:type="spellStart"/>
-      <w:r>
-        <w:rPr>
-          <w:rFonts w:asciiTheme="minorHAnsi" w:eastAsiaTheme="minorHAnsi" w:hAnsiTheme="minorHAnsi" w:cstheme="minorBidi"/>
-          <w:iCs/>
-          <w:color w:val="000000" w:themeColor="text1"/>
-          <w:sz w:val="24"/>
-          <w:szCs w:val="24"/>
-        </w:rPr>
-        <w:t>React</w:t>
-      </w:r>
-      <w:proofErr w:type="spellEnd"/>
-      <w:r>
-        <w:rPr>
-          <w:rFonts w:asciiTheme="minorHAnsi" w:eastAsiaTheme="minorHAnsi" w:hAnsiTheme="minorHAnsi" w:cstheme="minorBidi"/>
-          <w:iCs/>
-          <w:color w:val="000000" w:themeColor="text1"/>
-          <w:sz w:val="24"/>
-          <w:szCs w:val="24"/>
-        </w:rPr>
-        <w:t>-komponenter og rydde i prosjektdokumentasjon.</w:t>
+        <w:t>Etablere backend-infrastruktur (Docker), starte utvikling av React-komponenter og rydde i prosjektdokumentasjon.</w:t>
       </w:r>
     </w:p>
     <w:p>
@@ -366,7 +300,6 @@
           <w:szCs w:val="24"/>
         </w:rPr>
       </w:pPr>
-      <w:proofErr w:type="spellStart"/>
       <w:r>
         <w:rPr>
           <w:rFonts w:asciiTheme="minorHAnsi" w:hAnsiTheme="minorHAnsi"/>
@@ -376,19 +309,7 @@
           <w:sz w:val="24"/>
           <w:szCs w:val="24"/>
         </w:rPr>
-        <w:t>Issue</w:t>
-      </w:r>
-      <w:proofErr w:type="spellEnd"/>
-      <w:r>
-        <w:rPr>
-          <w:rFonts w:asciiTheme="minorHAnsi" w:hAnsiTheme="minorHAnsi"/>
-          <w:b/>
-          <w:bCs/>
-          <w:color w:val="auto"/>
-          <w:sz w:val="24"/>
-          <w:szCs w:val="24"/>
-        </w:rPr>
-        <w:t xml:space="preserve"> #11</w:t>
+        <w:t>Issue #11</w:t>
       </w:r>
       <w:r>
         <w:rPr>
@@ -421,79 +342,24 @@
       <w:pPr>
         <w:pStyle w:val="ListBullet"/>
       </w:pPr>
-      <w:proofErr w:type="spellStart"/>
-      <w:r>
-        <w:t>Issue</w:t>
-      </w:r>
-      <w:proofErr w:type="spellEnd"/>
-      <w:r>
-        <w:t xml:space="preserve"> #14 – </w:t>
-      </w:r>
-      <w:proofErr w:type="spellStart"/>
-      <w:r>
-        <w:t>Create</w:t>
-      </w:r>
-      <w:proofErr w:type="spellEnd"/>
-      <w:r>
-        <w:t xml:space="preserve"> </w:t>
-      </w:r>
-      <w:proofErr w:type="spellStart"/>
-      <w:r>
-        <w:t>components</w:t>
-      </w:r>
-      <w:proofErr w:type="spellEnd"/>
-      <w:r>
-        <w:t xml:space="preserve"> for </w:t>
-      </w:r>
-      <w:proofErr w:type="spellStart"/>
-      <w:r>
-        <w:t>frontend</w:t>
-      </w:r>
-      <w:proofErr w:type="spellEnd"/>
-      <w:r>
-        <w:t xml:space="preserve"> (Forsinket pga. sykdom).</w:t>
+      <w:r>
+        <w:t>Issue #14 – Create components for frontend (Forsinket pga. sykdom).</w:t>
       </w:r>
     </w:p>
     <w:p>
       <w:pPr>
         <w:pStyle w:val="ListBullet"/>
       </w:pPr>
-      <w:proofErr w:type="spellStart"/>
-      <w:r>
-        <w:t>Issue</w:t>
-      </w:r>
-      <w:proofErr w:type="spellEnd"/>
-      <w:r>
-        <w:t xml:space="preserve"> #15 – Update </w:t>
-      </w:r>
-      <w:proofErr w:type="spellStart"/>
-      <w:r>
-        <w:t>of</w:t>
-      </w:r>
-      <w:proofErr w:type="spellEnd"/>
-      <w:r>
-        <w:t xml:space="preserve"> </w:t>
-      </w:r>
-      <w:proofErr w:type="spellStart"/>
-      <w:r>
-        <w:t>documents</w:t>
-      </w:r>
-      <w:proofErr w:type="spellEnd"/>
-      <w:r>
-        <w:t xml:space="preserve"> (Påbegynt, men ikke ferdigstilt).</w:t>
+      <w:r>
+        <w:t>Issue #15 – Update of documents (Påbegynt, men ikke ferdigstilt).</w:t>
       </w:r>
     </w:p>
     <w:p>
       <w:pPr>
         <w:pStyle w:val="ListBullet"/>
       </w:pPr>
-      <w:proofErr w:type="spellStart"/>
-      <w:r>
-        <w:t>Issue</w:t>
-      </w:r>
-      <w:proofErr w:type="spellEnd"/>
-      <w:r>
-        <w:t xml:space="preserve"> #17 – Setup turf.js (I arbeid).</w:t>
+      <w:r>
+        <w:t>Issue #17 – Setup turf.js (I arbeid).</w:t>
       </w:r>
     </w:p>
     <w:p>
@@ -501,13 +367,7 @@
         <w:pStyle w:val="ListBullet"/>
       </w:pPr>
       <w:r>
-        <w:t xml:space="preserve">Årsak: Både Daniel og </w:t>
-      </w:r>
-      <w:r>
-        <w:t xml:space="preserve">Aleksander </w:t>
-      </w:r>
-      <w:r>
-        <w:t>har vært preget av sykdom. Kapasiteten i teamet var nede i ca. 40-50% av normalt nivå, som gjorde at tunge utviklingsoppgaver tok lenger tid.</w:t>
+        <w:t>Årsak: Både Daniel og Aleksander har vært preget av sykdom. Kapasiteten i teamet var nede i ca. 40-50% av normalt nivå, som gjorde at tunge utviklingsoppgaver tok lenger tid.</w:t>
       </w:r>
     </w:p>
     <w:p>
@@ -537,23 +397,7 @@
           <w:i w:val="0"/>
           <w:color w:val="000000" w:themeColor="text1"/>
         </w:rPr>
-        <w:t xml:space="preserve">og vi har funnet ut hvilken </w:t>
-      </w:r>
-      <w:proofErr w:type="spellStart"/>
-      <w:r>
-        <w:rPr>
-          <w:i w:val="0"/>
-          <w:color w:val="000000" w:themeColor="text1"/>
-        </w:rPr>
-        <w:t>biblotek</w:t>
-      </w:r>
-      <w:proofErr w:type="spellEnd"/>
-      <w:r>
-        <w:rPr>
-          <w:i w:val="0"/>
-          <w:color w:val="000000" w:themeColor="text1"/>
-        </w:rPr>
-        <w:t xml:space="preserve"> de vil at vi skal bruke.</w:t>
+        <w:t>og vi har funnet ut hvilken biblotek de vil at vi skal bruke.</w:t>
       </w:r>
     </w:p>
     <w:p>
@@ -815,21 +659,11 @@
     <w:r>
       <w:t xml:space="preserve"> </w:t>
     </w:r>
-    <w:r>
-      <w:fldChar w:fldCharType="begin"/>
-    </w:r>
-    <w:r>
-      <w:instrText xml:space="preserve"> NUMPAGES </w:instrText>
-    </w:r>
-    <w:r>
-      <w:fldChar w:fldCharType="separate"/>
-    </w:r>
-    <w:r>
-      <w:t>1</w:t>
-    </w:r>
-    <w:r>
-      <w:fldChar w:fldCharType="end"/>
-    </w:r>
+    <w:fldSimple w:instr=" NUMPAGES ">
+      <w:r>
+        <w:t>1</w:t>
+      </w:r>
+    </w:fldSimple>
   </w:p>
   <w:p>
     <w:pPr>
@@ -2234,6 +2068,7 @@
   <w:style w:type="character" w:default="1" w:styleId="DefaultParagraphFont">
     <w:name w:val="Default Paragraph Font"/>
     <w:uiPriority w:val="1"/>
+    <w:semiHidden/>
     <w:unhideWhenUsed/>
   </w:style>
   <w:style w:type="table" w:default="1" w:styleId="TableNormal">

</xml_diff>